<commit_message>
Remove the Suffix field from the form (and from generated documents)
User-facing change: the Suffix input is gone from the data-entry page.
Behind the scenes: TitleJob.suffix removed, filename generator drops the
suffix segment, and the docx templates are regenerated so the parcel
header and certification sentences no longer carry an orphan '-' that
used to sit between PARCEL and the (now-deleted) SUFFIX field.

build_templates.py now strips the literal '-' run preceding any
SUFFIX/REF SUFFIX field before removing it, keeping the printed forms
visually clean.

Co-Authored-By: Claude Opus 4.7 (1M context) <noreply@anthropic.com>
</commit_message>
<xml_diff>
--- a/templates_docx/re46_template.docx
+++ b/templates_docx/re46_template.docx
@@ -179,15 +179,6 @@
             </w:r>
             <w:bookmarkStart w:id="1" w:name="PARCEL"/>
             <w:bookmarkEnd w:id="1"/>
-            <w:r>
-              <w:t>-</w:t>
-            </w:r>
-            <w:r>
-              <w:rPr>
-                <w:noProof/>
-              </w:rPr>
-              <w:t xml:space="preserve">{{ suffix }}</w:t>
-            </w:r>
             <w:bookmarkStart w:id="2" w:name="SUFFIX"/>
             <w:bookmarkEnd w:id="2"/>
           </w:p>
@@ -3685,20 +3676,6 @@
           <w:sz w:val="18"/>
           <w:szCs w:val="18"/>
         </w:rPr>
-        <w:t>-</w:t>
-      </w:r>
-      <w:r>
-        <w:rPr>
-          <w:sz w:val="18"/>
-          <w:szCs w:val="18"/>
-        </w:rPr>
-        <w:t xml:space="preserve">{{ suffix }}</w:t>
-      </w:r>
-      <w:r>
-        <w:rPr>
-          <w:sz w:val="18"/>
-          <w:szCs w:val="18"/>
-        </w:rPr>
         <w:t xml:space="preserve"> </w:t>
       </w:r>
       <w:r>
@@ -4140,20 +4117,6 @@
                 <w:szCs w:val="18"/>
               </w:rPr>
               <w:t xml:space="preserve"> </w:t>
-            </w:r>
-            <w:r>
-              <w:rPr>
-                <w:sz w:val="18"/>
-                <w:szCs w:val="18"/>
-              </w:rPr>
-              <w:t>-</w:t>
-            </w:r>
-            <w:r>
-              <w:rPr>
-                <w:sz w:val="18"/>
-                <w:szCs w:val="18"/>
-              </w:rPr>
-              <w:t xml:space="preserve">{{ suffix }}</w:t>
             </w:r>
             <w:r>
               <w:rPr>

</xml_diff>

<commit_message>
Make Easements a multi-entry repeater (add multiple per parcel)
- TitleJob.easements is now a list of {name, type} entries (EasementEntry).
  The old single-entry fields are gone from the model.
- RE 46 template: the (3-C) Easements row repeats once per entry via a
  {%tr for e in easements %} marker pair (added in build_templates.py).
- Frontend: easements section is a repeater table with an Add easement
  button; Name & Address is an auto-expanding textarea.
- Legacy migration: when an old saved job is reopened, its
  easements_name / easements_type are silently converted into one entry
  in the new list so no data is lost.

Co-Authored-By: Claude Opus 4.7 (1M context) <noreply@anthropic.com>
</commit_message>
<xml_diff>
--- a/templates_docx/re46_template.docx
+++ b/templates_docx/re46_template.docx
@@ -2063,15 +2063,11 @@
                 <w:szCs w:val="18"/>
               </w:rPr>
             </w:pPr>
-            <w:r>
-              <w:rPr>
-                <w:sz w:val="18"/>
-                <w:szCs w:val="18"/>
-              </w:rPr>
-              <w:t xml:space="preserve">{{ easements_name }}</w:t>
-            </w:r>
             <w:bookmarkStart w:id="22" w:name="EasementsNameAddress"/>
             <w:bookmarkEnd w:id="22"/>
+            <w:r>
+              <w:t xml:space="preserve">{%tr for e in easements %}</w:t>
+            </w:r>
           </w:p>
         </w:tc>
         <w:tc>
@@ -2086,15 +2082,121 @@
                 <w:szCs w:val="18"/>
               </w:rPr>
             </w:pPr>
-            <w:r>
-              <w:rPr>
-                <w:sz w:val="18"/>
-                <w:szCs w:val="18"/>
-              </w:rPr>
-              <w:t xml:space="preserve">{{ easements_type }}</w:t>
-            </w:r>
             <w:bookmarkStart w:id="23" w:name="EasementsType"/>
             <w:bookmarkEnd w:id="23"/>
+            <w:r>
+              <w:t xml:space="preserve"/>
+            </w:r>
+          </w:p>
+          <w:p>
+            <w:pPr>
+              <w:rPr>
+                <w:sz w:val="18"/>
+                <w:szCs w:val="18"/>
+              </w:rPr>
+            </w:pPr>
+          </w:p>
+        </w:tc>
+      </w:tr>
+      <w:tr>
+        <w:trPr>
+          <w:jc w:val="center"/>
+        </w:trPr>
+        <w:tc>
+          <w:tcPr>
+            <w:tcW w:w="7921" w:type="dxa"/>
+            <w:gridSpan w:val="6"/>
+          </w:tcPr>
+          <w:p>
+            <w:pPr>
+              <w:rPr>
+                <w:sz w:val="18"/>
+                <w:szCs w:val="18"/>
+              </w:rPr>
+            </w:pPr>
+            <w:r>
+              <w:rPr>
+                <w:sz w:val="18"/>
+                <w:szCs w:val="18"/>
+              </w:rPr>
+              <w:t xml:space="preserve">{{ e.name }}</w:t>
+            </w:r>
+            <w:bookmarkStart w:id="22" w:name="EasementsNameAddress"/>
+            <w:bookmarkEnd w:id="22"/>
+          </w:p>
+        </w:tc>
+        <w:tc>
+          <w:tcPr>
+            <w:tcW w:w="2695" w:type="dxa"/>
+            <w:gridSpan w:val="4"/>
+          </w:tcPr>
+          <w:p>
+            <w:pPr>
+              <w:rPr>
+                <w:sz w:val="18"/>
+                <w:szCs w:val="18"/>
+              </w:rPr>
+            </w:pPr>
+            <w:r>
+              <w:rPr>
+                <w:sz w:val="18"/>
+                <w:szCs w:val="18"/>
+              </w:rPr>
+              <w:t xml:space="preserve">{{ e.type }}</w:t>
+            </w:r>
+            <w:bookmarkStart w:id="23" w:name="EasementsType"/>
+            <w:bookmarkEnd w:id="23"/>
+          </w:p>
+          <w:p>
+            <w:pPr>
+              <w:rPr>
+                <w:sz w:val="18"/>
+                <w:szCs w:val="18"/>
+              </w:rPr>
+            </w:pPr>
+          </w:p>
+        </w:tc>
+      </w:tr>
+      <w:tr>
+        <w:trPr>
+          <w:jc w:val="center"/>
+        </w:trPr>
+        <w:tc>
+          <w:tcPr>
+            <w:tcW w:w="7921" w:type="dxa"/>
+            <w:gridSpan w:val="6"/>
+          </w:tcPr>
+          <w:p>
+            <w:pPr>
+              <w:rPr>
+                <w:sz w:val="18"/>
+                <w:szCs w:val="18"/>
+              </w:rPr>
+            </w:pPr>
+            <w:bookmarkStart w:id="22" w:name="EasementsNameAddress"/>
+            <w:bookmarkEnd w:id="22"/>
+            <w:r>
+              <w:t xml:space="preserve">{%tr endfor %}</w:t>
+            </w:r>
+          </w:p>
+        </w:tc>
+        <w:tc>
+          <w:tcPr>
+            <w:tcW w:w="2695" w:type="dxa"/>
+            <w:gridSpan w:val="4"/>
+          </w:tcPr>
+          <w:p>
+            <w:pPr>
+              <w:rPr>
+                <w:sz w:val="18"/>
+                <w:szCs w:val="18"/>
+              </w:rPr>
+            </w:pPr>
+            <w:bookmarkStart w:id="23" w:name="EasementsType"/>
+            <w:bookmarkEnd w:id="23"/>
+            <w:r>
+              <w:t xml:space="preserve"/>
+            </w:r>
           </w:p>
           <w:p>
             <w:pPr>

</xml_diff>

<commit_message>
Add blank-line spacing between easements and before (4) Defects
Each repeated (3-C) easement row now carries two trailing blank
paragraphs, so consecutive easements are visually separated and the last
easement is spaced from the (4) Defects section in the generated RE 46.

Co-Authored-By: Claude Opus 4.7 (1M context) <noreply@anthropic.com>
</commit_message>
<xml_diff>
--- a/templates_docx/re46_template.docx
+++ b/templates_docx/re46_template.docx
@@ -2069,6 +2069,22 @@
               <w:t xml:space="preserve">{%tr for e in easements %}</w:t>
             </w:r>
           </w:p>
+          <w:p>
+            <w:pPr>
+              <w:rPr>
+                <w:sz w:val="18"/>
+                <w:szCs w:val="18"/>
+              </w:rPr>
+            </w:pPr>
+          </w:p>
+          <w:p>
+            <w:pPr>
+              <w:rPr>
+                <w:sz w:val="18"/>
+                <w:szCs w:val="18"/>
+              </w:rPr>
+            </w:pPr>
+          </w:p>
         </w:tc>
         <w:tc>
           <w:tcPr>
@@ -2124,6 +2140,22 @@
             <w:bookmarkStart w:id="22" w:name="EasementsNameAddress"/>
             <w:bookmarkEnd w:id="22"/>
           </w:p>
+          <w:p>
+            <w:pPr>
+              <w:rPr>
+                <w:sz w:val="18"/>
+                <w:szCs w:val="18"/>
+              </w:rPr>
+            </w:pPr>
+          </w:p>
+          <w:p>
+            <w:pPr>
+              <w:rPr>
+                <w:sz w:val="18"/>
+                <w:szCs w:val="18"/>
+              </w:rPr>
+            </w:pPr>
+          </w:p>
         </w:tc>
         <w:tc>
           <w:tcPr>
@@ -2178,6 +2210,22 @@
             <w:r>
               <w:t xml:space="preserve">{%tr endfor %}</w:t>
             </w:r>
+          </w:p>
+          <w:p>
+            <w:pPr>
+              <w:rPr>
+                <w:sz w:val="18"/>
+                <w:szCs w:val="18"/>
+              </w:rPr>
+            </w:pPr>
+          </w:p>
+          <w:p>
+            <w:pPr>
+              <w:rPr>
+                <w:sz w:val="18"/>
+                <w:szCs w:val="18"/>
+              </w:rPr>
+            </w:pPr>
           </w:p>
         </w:tc>
         <w:tc>

</xml_diff>

<commit_message>
Shift C/R/S / PARCEL / PID labels + values left ~2 spaces; restore C/R/S font
Reverts the 8pt C/R/S shrink (back to the form's normal size) and instead
nudges the header label+value block left by ~0.1" (≈2 spaces). Width is
taken from the TITLE REPORT column and given to the value column, so the
table's overall width and position are unchanged.

Co-Authored-By: Claude Opus 4.7 (1M context) <noreply@anthropic.com>
</commit_message>
<xml_diff>
--- a/templates_docx/re46_template.docx
+++ b/templates_docx/re46_template.docx
@@ -22,9 +22,9 @@
       </w:tblPr>
       <w:tblGrid>
         <w:gridCol w:w="2898"/>
-        <w:gridCol w:w="5148"/>
+        <w:gridCol w:w="5004"/>
         <w:gridCol w:w="1080"/>
-        <w:gridCol w:w="1481"/>
+        <w:gridCol w:w="1625"/>
       </w:tblGrid>
       <w:tr>
         <w:trPr>
@@ -66,7 +66,7 @@
         </w:tc>
         <w:tc>
           <w:tcPr>
-            <w:tcW w:w="5148" w:type="dxa"/>
+            <w:tcW w:w="5004" w:type="dxa"/>
             <w:vMerge w:val="restart"/>
             <w:vAlign w:val="center"/>
           </w:tcPr>
@@ -97,7 +97,7 @@
         </w:tc>
         <w:tc>
           <w:tcPr>
-            <w:tcW w:w="1481" w:type="dxa"/>
+            <w:tcW w:w="1625" w:type="dxa"/>
             <w:tcBorders>
               <w:bottom w:val="single" w:sz="4" w:space="0" w:color="auto"/>
             </w:tcBorders>
@@ -106,8 +106,6 @@
             <w:r>
               <w:rPr>
                 <w:noProof/>
-                <w:sz w:val="16"/>
-                <w:szCs w:val="16"/>
               </w:rPr>
               <w:t xml:space="preserve">{{ crs }}</w:t>
             </w:r>
@@ -149,7 +147,7 @@
         </w:tc>
         <w:tc>
           <w:tcPr>
-            <w:tcW w:w="5148" w:type="dxa"/>
+            <w:tcW w:w="5004" w:type="dxa"/>
             <w:vMerge/>
           </w:tcPr>
           <w:p/>
@@ -166,7 +164,7 @@
         </w:tc>
         <w:tc>
           <w:tcPr>
-            <w:tcW w:w="1481" w:type="dxa"/>
+            <w:tcW w:w="1625" w:type="dxa"/>
             <w:tcBorders>
               <w:top w:val="single" w:sz="4" w:space="0" w:color="auto"/>
               <w:bottom w:val="single" w:sz="4" w:space="0" w:color="auto"/>
@@ -198,7 +196,7 @@
         </w:tc>
         <w:tc>
           <w:tcPr>
-            <w:tcW w:w="5148" w:type="dxa"/>
+            <w:tcW w:w="5004" w:type="dxa"/>
             <w:vMerge/>
           </w:tcPr>
           <w:p/>
@@ -215,7 +213,7 @@
         </w:tc>
         <w:tc>
           <w:tcPr>
-            <w:tcW w:w="1481" w:type="dxa"/>
+            <w:tcW w:w="1625" w:type="dxa"/>
             <w:tcBorders>
               <w:top w:val="single" w:sz="4" w:space="0" w:color="auto"/>
               <w:bottom w:val="single" w:sz="4" w:space="0" w:color="auto"/>
@@ -245,7 +243,7 @@
         </w:tc>
         <w:tc>
           <w:tcPr>
-            <w:tcW w:w="5148" w:type="dxa"/>
+            <w:tcW w:w="5004" w:type="dxa"/>
             <w:vMerge/>
           </w:tcPr>
           <w:p/>
@@ -258,7 +256,7 @@
         </w:tc>
         <w:tc>
           <w:tcPr>
-            <w:tcW w:w="1481" w:type="dxa"/>
+            <w:tcW w:w="1625" w:type="dxa"/>
             <w:tcBorders>
               <w:top w:val="single" w:sz="4" w:space="0" w:color="auto"/>
             </w:tcBorders>

</xml_diff>

<commit_message>
Increase header left-shift to ~0.2" so the move is clearly visible
The prior 0.1" nudge of the C/R/S / PARCEL / PID block was too subtle to
notice. Doubled HEADER_SHIFT_TWIPS to 288 (~0.2") for a clearly visible
leftward shift.

Co-Authored-By: Claude Opus 4.7 (1M context) <noreply@anthropic.com>
</commit_message>
<xml_diff>
--- a/templates_docx/re46_template.docx
+++ b/templates_docx/re46_template.docx
@@ -22,9 +22,9 @@
       </w:tblPr>
       <w:tblGrid>
         <w:gridCol w:w="2898"/>
-        <w:gridCol w:w="5004"/>
+        <w:gridCol w:w="4860"/>
         <w:gridCol w:w="1080"/>
-        <w:gridCol w:w="1625"/>
+        <w:gridCol w:w="1769"/>
       </w:tblGrid>
       <w:tr>
         <w:trPr>
@@ -66,7 +66,7 @@
         </w:tc>
         <w:tc>
           <w:tcPr>
-            <w:tcW w:w="5004" w:type="dxa"/>
+            <w:tcW w:w="4860" w:type="dxa"/>
             <w:vMerge w:val="restart"/>
             <w:vAlign w:val="center"/>
           </w:tcPr>
@@ -97,7 +97,7 @@
         </w:tc>
         <w:tc>
           <w:tcPr>
-            <w:tcW w:w="1625" w:type="dxa"/>
+            <w:tcW w:w="1769" w:type="dxa"/>
             <w:tcBorders>
               <w:bottom w:val="single" w:sz="4" w:space="0" w:color="auto"/>
             </w:tcBorders>
@@ -149,7 +149,7 @@
         </w:tc>
         <w:tc>
           <w:tcPr>
-            <w:tcW w:w="5004" w:type="dxa"/>
+            <w:tcW w:w="4860" w:type="dxa"/>
             <w:vMerge/>
           </w:tcPr>
           <w:p/>
@@ -166,7 +166,7 @@
         </w:tc>
         <w:tc>
           <w:tcPr>
-            <w:tcW w:w="1625" w:type="dxa"/>
+            <w:tcW w:w="1769" w:type="dxa"/>
             <w:tcBorders>
               <w:top w:val="single" w:sz="4" w:space="0" w:color="auto"/>
               <w:bottom w:val="single" w:sz="4" w:space="0" w:color="auto"/>
@@ -198,7 +198,7 @@
         </w:tc>
         <w:tc>
           <w:tcPr>
-            <w:tcW w:w="5004" w:type="dxa"/>
+            <w:tcW w:w="4860" w:type="dxa"/>
             <w:vMerge/>
           </w:tcPr>
           <w:p/>
@@ -215,7 +215,7 @@
         </w:tc>
         <w:tc>
           <w:tcPr>
-            <w:tcW w:w="1625" w:type="dxa"/>
+            <w:tcW w:w="1769" w:type="dxa"/>
             <w:tcBorders>
               <w:top w:val="single" w:sz="4" w:space="0" w:color="auto"/>
               <w:bottom w:val="single" w:sz="4" w:space="0" w:color="auto"/>
@@ -245,7 +245,7 @@
         </w:tc>
         <w:tc>
           <w:tcPr>
-            <w:tcW w:w="5004" w:type="dxa"/>
+            <w:tcW w:w="4860" w:type="dxa"/>
             <w:vMerge/>
           </w:tcPr>
           <w:p/>
@@ -258,7 +258,7 @@
         </w:tc>
         <w:tc>
           <w:tcPr>
-            <w:tcW w:w="1625" w:type="dxa"/>
+            <w:tcW w:w="1769" w:type="dxa"/>
             <w:tcBorders>
               <w:top w:val="single" w:sz="4" w:space="0" w:color="auto"/>
             </w:tcBorders>

</xml_diff>